<commit_message>
Chap. 23 suivi : cellules « Minimum 3 ans » du Tableau 6 en modif. suivie (3->5 ans)
Cohérence du Tableau 6 : les 5 cellules « Minimum 3 ans » sont désormais
corrigées en « Minimum 5 ans » sous forme de modification suivie au nom de
Dr IBRAHIMA DIALLO, alignées sur la correction narrative. Les changements
des autres relecteurs restent intacts. Validé (XSD) ; acceptation vérifiée.

Co-Authored-By: Claude Opus 4.8 <noreply@anthropic.com>
Claude-Session: https://claude.ai/code/session_01JdPj9UbiVsj4tSmm6xDfYr
</commit_message>
<xml_diff>
--- a/Chapitre23_Revue_Dr_IBRAHIMA_DIALLO/OKAPI_Chapitre23_SUIVI_MODIFICATIONS_Dr_IBRAHIMA_DIALLO.docx
+++ b/Chapitre23_Revue_Dr_IBRAHIMA_DIALLO/OKAPI_Chapitre23_SUIVI_MODIFICATIONS_Dr_IBRAHIMA_DIALLO.docx
@@ -10262,7 +10262,35 @@
                 <w:sz w:val="20"/>
                 <w:szCs w:val="20"/>
               </w:rPr>
-              <w:t>Minimum 3 ans</w:t>
+              <w:t xml:space="preserve">Minimum </w:t>
+            </w:r>
+            <w:del w:id="95001" w:author="Dr IBRAHIMA DIALLO" w:date="2026-08-17T14:00:00Z">
+              <w:r>
+                <w:rPr>
+                  <w:rFonts w:ascii="Arial" w:hAnsi="Arial" w:cs="Arial"/>
+                  <w:sz w:val="20"/>
+                  <w:szCs w:val="20"/>
+                </w:rPr>
+                <w:delText xml:space="preserve">3</w:delText>
+              </w:r>
+            </w:del>
+            <w:ins w:id="95002" w:author="Dr IBRAHIMA DIALLO" w:date="2026-08-17T14:00:00Z">
+              <w:r>
+                <w:rPr>
+                  <w:rFonts w:ascii="Arial" w:hAnsi="Arial" w:cs="Arial"/>
+                  <w:sz w:val="20"/>
+                  <w:szCs w:val="20"/>
+                </w:rPr>
+                <w:t xml:space="preserve">5</w:t>
+              </w:r>
+            </w:ins>
+            <w:r>
+              <w:rPr>
+                <w:rFonts w:ascii="Arial" w:hAnsi="Arial" w:cs="Arial"/>
+                <w:sz w:val="20"/>
+                <w:szCs w:val="20"/>
+              </w:rPr>
+              <w:t xml:space="preserve"> ans</w:t>
             </w:r>
           </w:p>
         </w:tc>
@@ -10333,7 +10361,35 @@
                 <w:sz w:val="20"/>
                 <w:szCs w:val="20"/>
               </w:rPr>
-              <w:t>Minimum 3 ans</w:t>
+              <w:t xml:space="preserve">Minimum </w:t>
+            </w:r>
+            <w:del w:id="95003" w:author="Dr IBRAHIMA DIALLO" w:date="2026-08-17T14:00:00Z">
+              <w:r>
+                <w:rPr>
+                  <w:rFonts w:ascii="Arial" w:hAnsi="Arial" w:cs="Arial"/>
+                  <w:sz w:val="20"/>
+                  <w:szCs w:val="20"/>
+                </w:rPr>
+                <w:delText xml:space="preserve">3</w:delText>
+              </w:r>
+            </w:del>
+            <w:ins w:id="95004" w:author="Dr IBRAHIMA DIALLO" w:date="2026-08-17T14:00:00Z">
+              <w:r>
+                <w:rPr>
+                  <w:rFonts w:ascii="Arial" w:hAnsi="Arial" w:cs="Arial"/>
+                  <w:sz w:val="20"/>
+                  <w:szCs w:val="20"/>
+                </w:rPr>
+                <w:t xml:space="preserve">5</w:t>
+              </w:r>
+            </w:ins>
+            <w:r>
+              <w:rPr>
+                <w:rFonts w:ascii="Arial" w:hAnsi="Arial" w:cs="Arial"/>
+                <w:sz w:val="20"/>
+                <w:szCs w:val="20"/>
+              </w:rPr>
+              <w:t xml:space="preserve"> ans</w:t>
             </w:r>
           </w:p>
         </w:tc>
@@ -10404,7 +10460,35 @@
                 <w:sz w:val="20"/>
                 <w:szCs w:val="20"/>
               </w:rPr>
-              <w:t>Minimum 3 ans</w:t>
+              <w:t xml:space="preserve">Minimum </w:t>
+            </w:r>
+            <w:del w:id="95005" w:author="Dr IBRAHIMA DIALLO" w:date="2026-08-17T14:00:00Z">
+              <w:r>
+                <w:rPr>
+                  <w:rFonts w:ascii="Arial" w:hAnsi="Arial" w:cs="Arial"/>
+                  <w:sz w:val="20"/>
+                  <w:szCs w:val="20"/>
+                </w:rPr>
+                <w:delText xml:space="preserve">3</w:delText>
+              </w:r>
+            </w:del>
+            <w:ins w:id="95006" w:author="Dr IBRAHIMA DIALLO" w:date="2026-08-17T14:00:00Z">
+              <w:r>
+                <w:rPr>
+                  <w:rFonts w:ascii="Arial" w:hAnsi="Arial" w:cs="Arial"/>
+                  <w:sz w:val="20"/>
+                  <w:szCs w:val="20"/>
+                </w:rPr>
+                <w:t xml:space="preserve">5</w:t>
+              </w:r>
+            </w:ins>
+            <w:r>
+              <w:rPr>
+                <w:rFonts w:ascii="Arial" w:hAnsi="Arial" w:cs="Arial"/>
+                <w:sz w:val="20"/>
+                <w:szCs w:val="20"/>
+              </w:rPr>
+              <w:t xml:space="preserve"> ans</w:t>
             </w:r>
           </w:p>
         </w:tc>
@@ -10475,7 +10559,35 @@
                 <w:sz w:val="20"/>
                 <w:szCs w:val="20"/>
               </w:rPr>
-              <w:t>Minimum 3 ans</w:t>
+              <w:t xml:space="preserve">Minimum </w:t>
+            </w:r>
+            <w:del w:id="95007" w:author="Dr IBRAHIMA DIALLO" w:date="2026-08-17T14:00:00Z">
+              <w:r>
+                <w:rPr>
+                  <w:rFonts w:ascii="Arial" w:hAnsi="Arial" w:cs="Arial"/>
+                  <w:sz w:val="20"/>
+                  <w:szCs w:val="20"/>
+                </w:rPr>
+                <w:delText xml:space="preserve">3</w:delText>
+              </w:r>
+            </w:del>
+            <w:ins w:id="95008" w:author="Dr IBRAHIMA DIALLO" w:date="2026-08-17T14:00:00Z">
+              <w:r>
+                <w:rPr>
+                  <w:rFonts w:ascii="Arial" w:hAnsi="Arial" w:cs="Arial"/>
+                  <w:sz w:val="20"/>
+                  <w:szCs w:val="20"/>
+                </w:rPr>
+                <w:t xml:space="preserve">5</w:t>
+              </w:r>
+            </w:ins>
+            <w:r>
+              <w:rPr>
+                <w:rFonts w:ascii="Arial" w:hAnsi="Arial" w:cs="Arial"/>
+                <w:sz w:val="20"/>
+                <w:szCs w:val="20"/>
+              </w:rPr>
+              <w:t xml:space="preserve"> ans</w:t>
             </w:r>
           </w:p>
         </w:tc>
@@ -10546,7 +10658,35 @@
                 <w:sz w:val="20"/>
                 <w:szCs w:val="20"/>
               </w:rPr>
-              <w:t>Minimum 3 ans</w:t>
+              <w:t xml:space="preserve">Minimum </w:t>
+            </w:r>
+            <w:del w:id="95009" w:author="Dr IBRAHIMA DIALLO" w:date="2026-08-17T14:00:00Z">
+              <w:r>
+                <w:rPr>
+                  <w:rFonts w:ascii="Arial" w:hAnsi="Arial" w:cs="Arial"/>
+                  <w:sz w:val="20"/>
+                  <w:szCs w:val="20"/>
+                </w:rPr>
+                <w:delText xml:space="preserve">3</w:delText>
+              </w:r>
+            </w:del>
+            <w:ins w:id="95010" w:author="Dr IBRAHIMA DIALLO" w:date="2026-08-17T14:00:00Z">
+              <w:r>
+                <w:rPr>
+                  <w:rFonts w:ascii="Arial" w:hAnsi="Arial" w:cs="Arial"/>
+                  <w:sz w:val="20"/>
+                  <w:szCs w:val="20"/>
+                </w:rPr>
+                <w:t xml:space="preserve">5</w:t>
+              </w:r>
+            </w:ins>
+            <w:r>
+              <w:rPr>
+                <w:rFonts w:ascii="Arial" w:hAnsi="Arial" w:cs="Arial"/>
+                <w:sz w:val="20"/>
+                <w:szCs w:val="20"/>
+              </w:rPr>
+              <w:t xml:space="preserve"> ans</w:t>
             </w:r>
           </w:p>
         </w:tc>

</xml_diff>